<commit_message>
Complete answered experiment report
</commit_message>
<xml_diff>
--- a/实验3-数字图像处理实验指导书-作答版.docx
+++ b/实验3-数字图像处理实验指导书-作答版.docx
@@ -532,6 +532,213 @@
       </w:r>
     </w:p>
     <w:p>
+      <w:pPr/>
+      <w:r>
+        <w:rPr>
+          <w:rFonts w:ascii="Times New Roman" w:hAnsi="Times New Roman" w:eastAsia="Times New Roman"/>
+          <w:b/>
+          <w:sz w:val="21"/>
+        </w:rPr>
+        <w:t>1.噪声生成 实验结果与分析：</w:t>
+      </w:r>
+    </w:p>
+    <w:p>
+      <w:pPr/>
+      <w:r>
+        <w:rPr>
+          <w:rFonts w:ascii="Times New Roman" w:hAnsi="Times New Roman" w:eastAsia="Times New Roman"/>
+          <w:b w:val="0"/>
+          <w:sz w:val="21"/>
+        </w:rPr>
+        <w:t>高斯噪声表现为整幅图像灰度的随机扰动，方差从0.2增大到0.8时，图像颗粒感增强，局部细节和对比关系被随机波动淹没得更明显。</w:t>
+      </w:r>
+    </w:p>
+    <w:p>
+      <w:pPr/>
+      <w:r>
+        <w:rPr>
+          <w:rFonts w:ascii="Times New Roman" w:hAnsi="Times New Roman" w:eastAsia="Times New Roman"/>
+          <w:b w:val="0"/>
+          <w:sz w:val="21"/>
+        </w:rPr>
+        <w:t>椒盐噪声表现为随机黑白脉冲点，概率从0.2增大到0.8时，黑白噪声点密度快速增加，图像结构被大量极值像素破坏，主观可辨性明显下降。</w:t>
+      </w:r>
+    </w:p>
+    <w:p>
+      <w:pPr/>
+      <w:r>
+        <w:rPr>
+          <w:rFonts w:ascii="Times New Roman" w:hAnsi="Times New Roman" w:eastAsia="Times New Roman"/>
+          <w:b w:val="0"/>
+          <w:sz w:val="21"/>
+        </w:rPr>
+        <w:t>图1-1 electric.tif加入不同方差高斯噪声的结果</w:t>
+      </w:r>
+    </w:p>
+    <w:p>
+      <w:pPr/>
+      <w:r>
+        <w:drawing>
+          <wp:inline xmlns:a="http://schemas.openxmlformats.org/drawingml/2006/main" xmlns:pic="http://schemas.openxmlformats.org/drawingml/2006/picture">
+            <wp:extent cx="5303520" cy="4322369"/>
+            <wp:docPr id="7" name="Picture 7"/>
+            <wp:cNvGraphicFramePr>
+              <a:graphicFrameLocks noChangeAspect="1"/>
+            </wp:cNvGraphicFramePr>
+            <a:graphic>
+              <a:graphicData uri="http://schemas.openxmlformats.org/drawingml/2006/picture">
+                <pic:pic>
+                  <pic:nvPicPr>
+                    <pic:cNvPr id="0" name="exp3_1_gaussian_noise.jpg"/>
+                    <pic:cNvPicPr/>
+                  </pic:nvPicPr>
+                  <pic:blipFill>
+                    <a:blip r:embed="rId14"/>
+                    <a:stretch>
+                      <a:fillRect/>
+                    </a:stretch>
+                  </pic:blipFill>
+                  <pic:spPr>
+                    <a:xfrm>
+                      <a:off x="0" y="0"/>
+                      <a:ext cx="5303520" cy="4322369"/>
+                    </a:xfrm>
+                    <a:prstGeom prst="rect"/>
+                  </pic:spPr>
+                </pic:pic>
+              </a:graphicData>
+            </a:graphic>
+          </wp:inline>
+        </w:drawing>
+      </w:r>
+    </w:p>
+    <w:p>
+      <w:pPr/>
+      <w:r>
+        <w:rPr>
+          <w:rFonts w:ascii="Times New Roman" w:hAnsi="Times New Roman" w:eastAsia="Times New Roman"/>
+          <w:b w:val="0"/>
+          <w:sz w:val="21"/>
+        </w:rPr>
+        <w:t>图1-2 electric.tif加入不同概率椒盐噪声的结果</w:t>
+      </w:r>
+    </w:p>
+    <w:p>
+      <w:pPr/>
+      <w:r>
+        <w:drawing>
+          <wp:inline xmlns:a="http://schemas.openxmlformats.org/drawingml/2006/main" xmlns:pic="http://schemas.openxmlformats.org/drawingml/2006/picture">
+            <wp:extent cx="5303520" cy="4322369"/>
+            <wp:docPr id="8" name="Picture 8"/>
+            <wp:cNvGraphicFramePr>
+              <a:graphicFrameLocks noChangeAspect="1"/>
+            </wp:cNvGraphicFramePr>
+            <a:graphic>
+              <a:graphicData uri="http://schemas.openxmlformats.org/drawingml/2006/picture">
+                <pic:pic>
+                  <pic:nvPicPr>
+                    <pic:cNvPr id="0" name="exp3_1_salt_pepper_noise.jpg"/>
+                    <pic:cNvPicPr/>
+                  </pic:nvPicPr>
+                  <pic:blipFill>
+                    <a:blip r:embed="rId15"/>
+                    <a:stretch>
+                      <a:fillRect/>
+                    </a:stretch>
+                  </pic:blipFill>
+                  <pic:spPr>
+                    <a:xfrm>
+                      <a:off x="0" y="0"/>
+                      <a:ext cx="5303520" cy="4322369"/>
+                    </a:xfrm>
+                    <a:prstGeom prst="rect"/>
+                  </pic:spPr>
+                </pic:pic>
+              </a:graphicData>
+            </a:graphic>
+          </wp:inline>
+        </w:drawing>
+      </w:r>
+    </w:p>
+    <w:p>
+      <w:pPr/>
+      <w:r>
+        <w:rPr>
+          <w:rFonts w:ascii="Times New Roman" w:hAnsi="Times New Roman" w:eastAsia="Times New Roman"/>
+          <w:b/>
+          <w:sz w:val="21"/>
+        </w:rPr>
+        <w:t>程序清单：exp3_1_noise_generation.m</w:t>
+      </w:r>
+    </w:p>
+    <w:p>
+      <w:pPr/>
+      <w:r>
+        <w:rPr>
+          <w:rFonts w:ascii="Times New Roman" w:hAnsi="Times New Roman" w:eastAsia="Times New Roman"/>
+          <w:b w:val="0"/>
+          <w:sz w:val="21"/>
+        </w:rPr>
+        <w:t>function exp3_1_noise_generation(rootDir)</w:t>
+        <w:br/>
+        <w:t>rng(20260521);</w:t>
+        <w:br/>
+        <w:t>img = im2double(imread(fullfile(rootDir, 'materials', 'electric.tif')));</w:t>
+        <w:br/>
+        <w:t>if ndims(img) == 3</w:t>
+        <w:br/>
+        <w:t xml:space="preserve">    img = rgb2gray(img);</w:t>
+        <w:br/>
+        <w:t>end</w:t>
+        <w:br/>
+        <w:br/>
+        <w:t>gaussianVars = [0.2, 0.5, 0.8];</w:t>
+        <w:br/>
+        <w:t>saltPepperDensity = [0.2, 0.5, 0.8];</w:t>
+        <w:br/>
+        <w:br/>
+        <w:t>fig1 = figure('Visible', 'off', 'Color', 'w', 'Position', [100 100 1200 800]);</w:t>
+        <w:br/>
+        <w:t>tiledlayout(2, 2, 'Padding', 'compact', 'TileSpacing', 'compact');</w:t>
+        <w:br/>
+        <w:t>nexttile; imshow(img, []); title('Original electric.tif');</w:t>
+        <w:br/>
+        <w:t>for k = 1:numel(gaussianVars)</w:t>
+        <w:br/>
+        <w:t xml:space="preserve">    noisy = imnoise(img, 'gaussian', 0, gaussianVars(k));</w:t>
+        <w:br/>
+        <w:t xml:space="preserve">    nexttile; imshow(noisy, []); title(sprintf('Gaussian noise, variance = %.1f', gaussianVars(k)));</w:t>
+        <w:br/>
+        <w:t>end</w:t>
+        <w:br/>
+        <w:t>exportgraphics(fig1, fullfile(rootDir, 'results', 'exp3_1_gaussian_noise.jpg'), 'Resolution', 180);</w:t>
+        <w:br/>
+        <w:t>close(fig1);</w:t>
+        <w:br/>
+        <w:br/>
+        <w:t>fig2 = figure('Visible', 'off', 'Color', 'w', 'Position', [100 100 1200 800]);</w:t>
+        <w:br/>
+        <w:t>tiledlayout(2, 2, 'Padding', 'compact', 'TileSpacing', 'compact');</w:t>
+        <w:br/>
+        <w:t>nexttile; imshow(img, []); title('Original electric.tif');</w:t>
+        <w:br/>
+        <w:t>for k = 1:numel(saltPepperDensity)</w:t>
+        <w:br/>
+        <w:t xml:space="preserve">    noisy = imnoise(img, 'salt &amp; pepper', saltPepperDensity(k));</w:t>
+        <w:br/>
+        <w:t xml:space="preserve">    nexttile; imshow(noisy, []); title(sprintf('Salt &amp; pepper noise, density = %.1f', saltPepperDensity(k)));</w:t>
+        <w:br/>
+        <w:t>end</w:t>
+        <w:br/>
+        <w:t>exportgraphics(fig2, fullfile(rootDir, 'results', 'exp3_1_salt_pepper_noise.jpg'), 'Resolution', 180);</w:t>
+        <w:br/>
+        <w:t>close(fig2);</w:t>
+        <w:br/>
+        <w:t>end</w:t>
+        <w:br/>
+      </w:r>
+    </w:p>
+    <w:p>
       <w:pPr>
         <w:adjustRightInd w:val="0"/>
         <w:snapToGrid w:val="0"/>
@@ -937,6 +1144,300 @@
       </w:r>
     </w:p>
     <w:p>
+      <w:pPr/>
+      <w:r>
+        <w:rPr>
+          <w:rFonts w:ascii="Times New Roman" w:hAnsi="Times New Roman" w:eastAsia="Times New Roman"/>
+          <w:b/>
+          <w:sz w:val="21"/>
+        </w:rPr>
+        <w:t>2.空间滤波去除噪声 实验结果与分析：</w:t>
+      </w:r>
+    </w:p>
+    <w:p>
+      <w:pPr/>
+      <w:r>
+        <w:rPr>
+          <w:rFonts w:ascii="Times New Roman" w:hAnsi="Times New Roman" w:eastAsia="Times New Roman"/>
+          <w:b w:val="0"/>
+          <w:sz w:val="21"/>
+        </w:rPr>
+        <w:t>对椒盐噪声使用相同3x3模板时，噪声概率越大，残留噪声越多，图像细节越难恢复；对概率0.5的椒盐噪声，模板由3x3增大到9x9时，噪声点明显减少，但边缘和细节也逐渐模糊。</w:t>
+      </w:r>
+    </w:p>
+    <w:p>
+      <w:pPr/>
+      <w:r>
+        <w:rPr>
+          <w:rFonts w:ascii="Times New Roman" w:hAnsi="Times New Roman" w:eastAsia="Times New Roman"/>
+          <w:b w:val="0"/>
+          <w:sz w:val="21"/>
+        </w:rPr>
+        <w:t>对高斯噪声，均值滤波能够通过邻域平均降低随机波动，中值滤波也有一定平滑效果但不如均值滤波自然；对椒盐噪声，中值滤波明显优于均值滤波，因为中值运算能抑制极端黑白噪声点，而均值滤波会把脉冲噪声扩散成灰斑。</w:t>
+      </w:r>
+    </w:p>
+    <w:p>
+      <w:pPr/>
+      <w:r>
+        <w:rPr>
+          <w:rFonts w:ascii="Times New Roman" w:hAnsi="Times New Roman" w:eastAsia="Times New Roman"/>
+          <w:b w:val="0"/>
+          <w:sz w:val="21"/>
+        </w:rPr>
+        <w:t>图2-1 3x3中值滤波对不同概率椒盐噪声的处理结果</w:t>
+      </w:r>
+    </w:p>
+    <w:p>
+      <w:pPr/>
+      <w:r>
+        <w:drawing>
+          <wp:inline xmlns:a="http://schemas.openxmlformats.org/drawingml/2006/main" xmlns:pic="http://schemas.openxmlformats.org/drawingml/2006/picture">
+            <wp:extent cx="5303520" cy="3579876"/>
+            <wp:docPr id="4" name="Picture 4"/>
+            <wp:cNvGraphicFramePr>
+              <a:graphicFrameLocks noChangeAspect="1"/>
+            </wp:cNvGraphicFramePr>
+            <a:graphic>
+              <a:graphicData uri="http://schemas.openxmlformats.org/drawingml/2006/picture">
+                <pic:pic>
+                  <pic:nvPicPr>
+                    <pic:cNvPr id="0" name="exp3_2_median_same_template.jpg"/>
+                    <pic:cNvPicPr/>
+                  </pic:nvPicPr>
+                  <pic:blipFill>
+                    <a:blip r:embed="rId11"/>
+                    <a:stretch>
+                      <a:fillRect/>
+                    </a:stretch>
+                  </pic:blipFill>
+                  <pic:spPr>
+                    <a:xfrm>
+                      <a:off x="0" y="0"/>
+                      <a:ext cx="5303520" cy="3579876"/>
+                    </a:xfrm>
+                    <a:prstGeom prst="rect"/>
+                  </pic:spPr>
+                </pic:pic>
+              </a:graphicData>
+            </a:graphic>
+          </wp:inline>
+        </w:drawing>
+      </w:r>
+    </w:p>
+    <w:p>
+      <w:pPr/>
+      <w:r>
+        <w:rPr>
+          <w:rFonts w:ascii="Times New Roman" w:hAnsi="Times New Roman" w:eastAsia="Times New Roman"/>
+          <w:b w:val="0"/>
+          <w:sz w:val="21"/>
+        </w:rPr>
+        <w:t>图2-2 不同模板大小的中值滤波结果</w:t>
+      </w:r>
+    </w:p>
+    <w:p>
+      <w:pPr/>
+      <w:r>
+        <w:drawing>
+          <wp:inline xmlns:a="http://schemas.openxmlformats.org/drawingml/2006/main" xmlns:pic="http://schemas.openxmlformats.org/drawingml/2006/picture">
+            <wp:extent cx="5303520" cy="4322369"/>
+            <wp:docPr id="5" name="Picture 5"/>
+            <wp:cNvGraphicFramePr>
+              <a:graphicFrameLocks noChangeAspect="1"/>
+            </wp:cNvGraphicFramePr>
+            <a:graphic>
+              <a:graphicData uri="http://schemas.openxmlformats.org/drawingml/2006/picture">
+                <pic:pic>
+                  <pic:nvPicPr>
+                    <pic:cNvPr id="0" name="exp3_2_median_different_templates.jpg"/>
+                    <pic:cNvPicPr/>
+                  </pic:nvPicPr>
+                  <pic:blipFill>
+                    <a:blip r:embed="rId12"/>
+                    <a:stretch>
+                      <a:fillRect/>
+                    </a:stretch>
+                  </pic:blipFill>
+                  <pic:spPr>
+                    <a:xfrm>
+                      <a:off x="0" y="0"/>
+                      <a:ext cx="5303520" cy="4322369"/>
+                    </a:xfrm>
+                    <a:prstGeom prst="rect"/>
+                  </pic:spPr>
+                </pic:pic>
+              </a:graphicData>
+            </a:graphic>
+          </wp:inline>
+        </w:drawing>
+      </w:r>
+    </w:p>
+    <w:p>
+      <w:pPr/>
+      <w:r>
+        <w:rPr>
+          <w:rFonts w:ascii="Times New Roman" w:hAnsi="Times New Roman" w:eastAsia="Times New Roman"/>
+          <w:b w:val="0"/>
+          <w:sz w:val="21"/>
+        </w:rPr>
+        <w:t>图2-3 均值滤波与中值滤波对高斯噪声和椒盐噪声的处理对比</w:t>
+      </w:r>
+    </w:p>
+    <w:p>
+      <w:pPr/>
+      <w:r>
+        <w:drawing>
+          <wp:inline xmlns:a="http://schemas.openxmlformats.org/drawingml/2006/main" xmlns:pic="http://schemas.openxmlformats.org/drawingml/2006/picture">
+            <wp:extent cx="5303520" cy="3579876"/>
+            <wp:docPr id="6" name="Picture 6"/>
+            <wp:cNvGraphicFramePr>
+              <a:graphicFrameLocks noChangeAspect="1"/>
+            </wp:cNvGraphicFramePr>
+            <a:graphic>
+              <a:graphicData uri="http://schemas.openxmlformats.org/drawingml/2006/picture">
+                <pic:pic>
+                  <pic:nvPicPr>
+                    <pic:cNvPr id="0" name="exp3_2_mean_vs_median.jpg"/>
+                    <pic:cNvPicPr/>
+                  </pic:nvPicPr>
+                  <pic:blipFill>
+                    <a:blip r:embed="rId13"/>
+                    <a:stretch>
+                      <a:fillRect/>
+                    </a:stretch>
+                  </pic:blipFill>
+                  <pic:spPr>
+                    <a:xfrm>
+                      <a:off x="0" y="0"/>
+                      <a:ext cx="5303520" cy="3579876"/>
+                    </a:xfrm>
+                    <a:prstGeom prst="rect"/>
+                  </pic:spPr>
+                </pic:pic>
+              </a:graphicData>
+            </a:graphic>
+          </wp:inline>
+        </w:drawing>
+      </w:r>
+    </w:p>
+    <w:p>
+      <w:pPr/>
+      <w:r>
+        <w:rPr>
+          <w:rFonts w:ascii="Times New Roman" w:hAnsi="Times New Roman" w:eastAsia="Times New Roman"/>
+          <w:b/>
+          <w:sz w:val="21"/>
+        </w:rPr>
+        <w:t>程序清单：exp3_2_spatial_denoising.m</w:t>
+      </w:r>
+    </w:p>
+    <w:p>
+      <w:pPr/>
+      <w:r>
+        <w:rPr>
+          <w:rFonts w:ascii="Times New Roman" w:hAnsi="Times New Roman" w:eastAsia="Times New Roman"/>
+          <w:b w:val="0"/>
+          <w:sz w:val="21"/>
+        </w:rPr>
+        <w:t>function exp3_2_spatial_denoising(rootDir)</w:t>
+        <w:br/>
+        <w:t>rng(20260521);</w:t>
+        <w:br/>
+        <w:t>img = im2double(imread(fullfile(rootDir, 'materials', 'electric.tif')));</w:t>
+        <w:br/>
+        <w:t>if ndims(img) == 3</w:t>
+        <w:br/>
+        <w:t xml:space="preserve">    img = rgb2gray(img);</w:t>
+        <w:br/>
+        <w:t>end</w:t>
+        <w:br/>
+        <w:br/>
+        <w:t>densityList = [0.2, 0.5, 0.8];</w:t>
+        <w:br/>
+        <w:t>fig1 = figure('Visible', 'off', 'Color', 'w', 'Position', [100 100 1300 850]);</w:t>
+        <w:br/>
+        <w:t>tiledlayout(2, 3, 'Padding', 'compact', 'TileSpacing', 'compact');</w:t>
+        <w:br/>
+        <w:t>for k = 1:numel(densityList)</w:t>
+        <w:br/>
+        <w:t xml:space="preserve">    noisy = imnoise(img, 'salt &amp; pepper', densityList(k));</w:t>
+        <w:br/>
+        <w:t xml:space="preserve">    filtered = medfilt2(noisy, [3 3]);</w:t>
+        <w:br/>
+        <w:t xml:space="preserve">    nexttile; imshow(noisy, []); title(sprintf('Noisy, density = %.1f', densityList(k)));</w:t>
+        <w:br/>
+        <w:t xml:space="preserve">    nexttile(k + 3); imshow(filtered, []); title('3x3 median filtering');</w:t>
+        <w:br/>
+        <w:t>end</w:t>
+        <w:br/>
+        <w:t>exportgraphics(fig1, fullfile(rootDir, 'results', 'exp3_2_median_same_template.jpg'), 'Resolution', 180);</w:t>
+        <w:br/>
+        <w:t>close(fig1);</w:t>
+        <w:br/>
+        <w:br/>
+        <w:t>noisy05 = imnoise(img, 'salt &amp; pepper', 0.5);</w:t>
+        <w:br/>
+        <w:t>templateList = [3, 5, 9];</w:t>
+        <w:br/>
+        <w:t>fig2 = figure('Visible', 'off', 'Color', 'w', 'Position', [100 100 1200 800]);</w:t>
+        <w:br/>
+        <w:t>tiledlayout(2, 2, 'Padding', 'compact', 'TileSpacing', 'compact');</w:t>
+        <w:br/>
+        <w:t>nexttile; imshow(noisy05, []); title('Salt &amp; pepper noise, density = 0.5');</w:t>
+        <w:br/>
+        <w:t>for k = 1:numel(templateList)</w:t>
+        <w:br/>
+        <w:t xml:space="preserve">    filtered = medfilt2(noisy05, [templateList(k), templateList(k)]);</w:t>
+        <w:br/>
+        <w:t xml:space="preserve">    nexttile; imshow(filtered, []); title(sprintf('%dx%d median filtering', templateList(k), templateList(k)));</w:t>
+        <w:br/>
+        <w:t>end</w:t>
+        <w:br/>
+        <w:t>exportgraphics(fig2, fullfile(rootDir, 'results', 'exp3_2_median_different_templates.jpg'), 'Resolution', 180);</w:t>
+        <w:br/>
+        <w:t>close(fig2);</w:t>
+        <w:br/>
+        <w:br/>
+        <w:t>gaussianNoisy = imnoise(img, 'gaussian', 0, 0.2);</w:t>
+        <w:br/>
+        <w:t>saltPepperNoisy = imnoise(img, 'salt &amp; pepper', 0.2);</w:t>
+        <w:br/>
+        <w:t>meanKernel = ones(3, 3) / 9;</w:t>
+        <w:br/>
+        <w:t>gaussianMean = imfilter(gaussianNoisy, meanKernel, 'replicate');</w:t>
+        <w:br/>
+        <w:t>gaussianMedian = medfilt2(gaussianNoisy, [3 3]);</w:t>
+        <w:br/>
+        <w:t>spMean = imfilter(saltPepperNoisy, meanKernel, 'replicate');</w:t>
+        <w:br/>
+        <w:t>spMedian = medfilt2(saltPepperNoisy, [3 3]);</w:t>
+        <w:br/>
+        <w:br/>
+        <w:t>fig3 = figure('Visible', 'off', 'Color', 'w', 'Position', [100 100 1300 850]);</w:t>
+        <w:br/>
+        <w:t>tiledlayout(2, 3, 'Padding', 'compact', 'TileSpacing', 'compact');</w:t>
+        <w:br/>
+        <w:t>nexttile; imshow(gaussianNoisy, []); title('Gaussian noise');</w:t>
+        <w:br/>
+        <w:t>nexttile; imshow(gaussianMean, []); title('3x3 mean filtering');</w:t>
+        <w:br/>
+        <w:t>nexttile; imshow(gaussianMedian, []); title('3x3 median filtering');</w:t>
+        <w:br/>
+        <w:t>nexttile; imshow(saltPepperNoisy, []); title('Salt &amp; pepper noise');</w:t>
+        <w:br/>
+        <w:t>nexttile; imshow(spMean, []); title('3x3 mean filtering');</w:t>
+        <w:br/>
+        <w:t>nexttile; imshow(spMedian, []); title('3x3 median filtering');</w:t>
+        <w:br/>
+        <w:t>exportgraphics(fig3, fullfile(rootDir, 'results', 'exp3_2_mean_vs_median.jpg'), 'Resolution', 180);</w:t>
+        <w:br/>
+        <w:t>close(fig3);</w:t>
+        <w:br/>
+        <w:t>end</w:t>
+        <w:br/>
+      </w:r>
+    </w:p>
+    <w:p>
       <w:pPr>
         <w:adjustRightInd w:val="0"/>
         <w:snapToGrid w:val="0"/>
@@ -1118,6 +1619,136 @@
       </w:r>
     </w:p>
     <w:p>
+      <w:pPr/>
+      <w:r>
+        <w:rPr>
+          <w:rFonts w:ascii="Times New Roman" w:hAnsi="Times New Roman" w:eastAsia="Times New Roman"/>
+          <w:b/>
+          <w:sz w:val="21"/>
+        </w:rPr>
+        <w:t>3.图像的锐化滤波 实验结果与分析：</w:t>
+      </w:r>
+    </w:p>
+    <w:p>
+      <w:pPr/>
+      <w:r>
+        <w:rPr>
+          <w:rFonts w:ascii="Times New Roman" w:hAnsi="Times New Roman" w:eastAsia="Times New Roman"/>
+          <w:b w:val="0"/>
+          <w:sz w:val="21"/>
+        </w:rPr>
+        <w:t>Laplacian滤波属于二阶微分锐化处理，能够突出建筑边缘、线条和灰度突变区域，使轮廓更加清晰；均值滤波属于平滑处理，能够抑制局部灰度起伏，但会使边缘和纹理变模糊。</w:t>
+      </w:r>
+    </w:p>
+    <w:p>
+      <w:pPr/>
+      <w:r>
+        <w:rPr>
+          <w:rFonts w:ascii="Times New Roman" w:hAnsi="Times New Roman" w:eastAsia="Times New Roman"/>
+          <w:b w:val="0"/>
+          <w:sz w:val="21"/>
+        </w:rPr>
+        <w:t>图3-1 原图、Laplacian锐化结果和均值滤波结果对比</w:t>
+      </w:r>
+    </w:p>
+    <w:p>
+      <w:pPr/>
+      <w:r>
+        <w:drawing>
+          <wp:inline xmlns:a="http://schemas.openxmlformats.org/drawingml/2006/main" xmlns:pic="http://schemas.openxmlformats.org/drawingml/2006/picture">
+            <wp:extent cx="5303520" cy="1697126"/>
+            <wp:docPr id="3" name="Picture 3"/>
+            <wp:cNvGraphicFramePr>
+              <a:graphicFrameLocks noChangeAspect="1"/>
+            </wp:cNvGraphicFramePr>
+            <a:graphic>
+              <a:graphicData uri="http://schemas.openxmlformats.org/drawingml/2006/picture">
+                <pic:pic>
+                  <pic:nvPicPr>
+                    <pic:cNvPr id="0" name="exp3_3_sharpening_and_mean.jpg"/>
+                    <pic:cNvPicPr/>
+                  </pic:nvPicPr>
+                  <pic:blipFill>
+                    <a:blip r:embed="rId10"/>
+                    <a:stretch>
+                      <a:fillRect/>
+                    </a:stretch>
+                  </pic:blipFill>
+                  <pic:spPr>
+                    <a:xfrm>
+                      <a:off x="0" y="0"/>
+                      <a:ext cx="5303520" cy="1697126"/>
+                    </a:xfrm>
+                    <a:prstGeom prst="rect"/>
+                  </pic:spPr>
+                </pic:pic>
+              </a:graphicData>
+            </a:graphic>
+          </wp:inline>
+        </w:drawing>
+      </w:r>
+    </w:p>
+    <w:p>
+      <w:pPr/>
+      <w:r>
+        <w:rPr>
+          <w:rFonts w:ascii="Times New Roman" w:hAnsi="Times New Roman" w:eastAsia="Times New Roman"/>
+          <w:b/>
+          <w:sz w:val="21"/>
+        </w:rPr>
+        <w:t>程序清单：exp3_3_sharpening.m</w:t>
+      </w:r>
+    </w:p>
+    <w:p>
+      <w:pPr/>
+      <w:r>
+        <w:rPr>
+          <w:rFonts w:ascii="Times New Roman" w:hAnsi="Times New Roman" w:eastAsia="Times New Roman"/>
+          <w:b w:val="0"/>
+          <w:sz w:val="21"/>
+        </w:rPr>
+        <w:t>function exp3_3_sharpening(rootDir)</w:t>
+        <w:br/>
+        <w:t>img = im2double(imread(fullfile(rootDir, 'materials', 'building.tif')));</w:t>
+        <w:br/>
+        <w:t>if ndims(img) == 3</w:t>
+        <w:br/>
+        <w:t xml:space="preserve">    img = rgb2gray(img);</w:t>
+        <w:br/>
+        <w:t>end</w:t>
+        <w:br/>
+        <w:br/>
+        <w:t>laplacianKernel = fspecial('laplacian', 0.2);</w:t>
+        <w:br/>
+        <w:t>laplacianResponse = filter2(laplacianKernel, img, 'same');</w:t>
+        <w:br/>
+        <w:t>sharpened = mat2gray(img - laplacianResponse);</w:t>
+        <w:br/>
+        <w:br/>
+        <w:t>meanKernel = fspecial('average', [5 5]);</w:t>
+        <w:br/>
+        <w:t>smoothed = mat2gray(filter2(meanKernel, img, 'same'));</w:t>
+        <w:br/>
+        <w:br/>
+        <w:t>fig = figure('Visible', 'off', 'Color', 'w', 'Position', [100 100 1300 500]);</w:t>
+        <w:br/>
+        <w:t>tiledlayout(1, 3, 'Padding', 'compact', 'TileSpacing', 'compact');</w:t>
+        <w:br/>
+        <w:t>nexttile; imshow(img, []); title('Original building.tif');</w:t>
+        <w:br/>
+        <w:t>nexttile; imshow(sharpened, []); title('Laplacian sharpening');</w:t>
+        <w:br/>
+        <w:t>nexttile; imshow(smoothed, []); title('Mean filtering');</w:t>
+        <w:br/>
+        <w:t>exportgraphics(fig, fullfile(rootDir, 'results', 'exp3_3_sharpening_and_mean.jpg'), 'Resolution', 180);</w:t>
+        <w:br/>
+        <w:t>close(fig);</w:t>
+        <w:br/>
+        <w:t>end</w:t>
+        <w:br/>
+      </w:r>
+    </w:p>
+    <w:p>
       <w:pPr>
         <w:adjustRightInd w:val="0"/>
         <w:snapToGrid w:val="0"/>
@@ -1215,6 +1846,289 @@
       </w:r>
     </w:p>
     <w:p>
+      <w:pPr/>
+      <w:r>
+        <w:rPr>
+          <w:rFonts w:ascii="Times New Roman" w:hAnsi="Times New Roman" w:eastAsia="Times New Roman"/>
+          <w:b/>
+          <w:sz w:val="21"/>
+        </w:rPr>
+        <w:t>4.滤波器去噪效果 实验结果与分析：</w:t>
+      </w:r>
+    </w:p>
+    <w:p>
+      <w:pPr/>
+      <w:r>
+        <w:rPr>
+          <w:rFonts w:ascii="Times New Roman" w:hAnsi="Times New Roman" w:eastAsia="Times New Roman"/>
+          <w:b w:val="0"/>
+          <w:sz w:val="21"/>
+        </w:rPr>
+        <w:t>实验采用 electric.tif，分别加入方差为0.2的高斯噪声和概率为0.2的椒盐噪声，然后使用自编均值滤波器与自编中值滤波器进行3x3、5x5、9x9模板处理。</w:t>
+      </w:r>
+    </w:p>
+    <w:p>
+      <w:pPr/>
+      <w:r>
+        <w:rPr>
+          <w:rFonts w:ascii="Times New Roman" w:hAnsi="Times New Roman" w:eastAsia="Times New Roman"/>
+          <w:b w:val="0"/>
+          <w:sz w:val="21"/>
+        </w:rPr>
+        <w:t>定性结果表明：均值滤波对高斯噪声有较明显的平滑作用，但会削弱边缘和细节；中值滤波对椒盐噪声效果更好，能够有效去除黑白脉冲点，同时较好保持边缘。模板越大，去噪越强，但图像越容易模糊，9x9模板细节损失最明显。</w:t>
+      </w:r>
+    </w:p>
+    <w:p>
+      <w:pPr/>
+      <w:r>
+        <w:rPr>
+          <w:rFonts w:ascii="Times New Roman" w:hAnsi="Times New Roman" w:eastAsia="Times New Roman"/>
+          <w:b w:val="0"/>
+          <w:sz w:val="21"/>
+        </w:rPr>
+        <w:t>图4-1 自编均值滤波器对高斯噪声和椒盐噪声的处理结果</w:t>
+      </w:r>
+    </w:p>
+    <w:p>
+      <w:pPr/>
+      <w:r>
+        <w:drawing>
+          <wp:inline xmlns:a="http://schemas.openxmlformats.org/drawingml/2006/main" xmlns:pic="http://schemas.openxmlformats.org/drawingml/2006/picture">
+            <wp:extent cx="5303520" cy="3129077"/>
+            <wp:docPr id="1" name="Picture 1"/>
+            <wp:cNvGraphicFramePr>
+              <a:graphicFrameLocks noChangeAspect="1"/>
+            </wp:cNvGraphicFramePr>
+            <a:graphic>
+              <a:graphicData uri="http://schemas.openxmlformats.org/drawingml/2006/picture">
+                <pic:pic>
+                  <pic:nvPicPr>
+                    <pic:cNvPr id="0" name="exp3_4_custom_mean_filter.jpg"/>
+                    <pic:cNvPicPr/>
+                  </pic:nvPicPr>
+                  <pic:blipFill>
+                    <a:blip r:embed="rId8"/>
+                    <a:stretch>
+                      <a:fillRect/>
+                    </a:stretch>
+                  </pic:blipFill>
+                  <pic:spPr>
+                    <a:xfrm>
+                      <a:off x="0" y="0"/>
+                      <a:ext cx="5303520" cy="3129077"/>
+                    </a:xfrm>
+                    <a:prstGeom prst="rect"/>
+                  </pic:spPr>
+                </pic:pic>
+              </a:graphicData>
+            </a:graphic>
+          </wp:inline>
+        </w:drawing>
+      </w:r>
+    </w:p>
+    <w:p>
+      <w:pPr/>
+      <w:r>
+        <w:rPr>
+          <w:rFonts w:ascii="Times New Roman" w:hAnsi="Times New Roman" w:eastAsia="Times New Roman"/>
+          <w:b w:val="0"/>
+          <w:sz w:val="21"/>
+        </w:rPr>
+        <w:t>图4-2 自编中值滤波器对高斯噪声和椒盐噪声的处理结果</w:t>
+      </w:r>
+    </w:p>
+    <w:p>
+      <w:pPr/>
+      <w:r>
+        <w:drawing>
+          <wp:inline xmlns:a="http://schemas.openxmlformats.org/drawingml/2006/main" xmlns:pic="http://schemas.openxmlformats.org/drawingml/2006/picture">
+            <wp:extent cx="5303520" cy="3129077"/>
+            <wp:docPr id="2" name="Picture 2"/>
+            <wp:cNvGraphicFramePr>
+              <a:graphicFrameLocks noChangeAspect="1"/>
+            </wp:cNvGraphicFramePr>
+            <a:graphic>
+              <a:graphicData uri="http://schemas.openxmlformats.org/drawingml/2006/picture">
+                <pic:pic>
+                  <pic:nvPicPr>
+                    <pic:cNvPr id="0" name="exp3_4_custom_median_filter.jpg"/>
+                    <pic:cNvPicPr/>
+                  </pic:nvPicPr>
+                  <pic:blipFill>
+                    <a:blip r:embed="rId9"/>
+                    <a:stretch>
+                      <a:fillRect/>
+                    </a:stretch>
+                  </pic:blipFill>
+                  <pic:spPr>
+                    <a:xfrm>
+                      <a:off x="0" y="0"/>
+                      <a:ext cx="5303520" cy="3129077"/>
+                    </a:xfrm>
+                    <a:prstGeom prst="rect"/>
+                  </pic:spPr>
+                </pic:pic>
+              </a:graphicData>
+            </a:graphic>
+          </wp:inline>
+        </w:drawing>
+      </w:r>
+    </w:p>
+    <w:p>
+      <w:pPr/>
+      <w:r>
+        <w:rPr>
+          <w:rFonts w:ascii="Times New Roman" w:hAnsi="Times New Roman" w:eastAsia="Times New Roman"/>
+          <w:b/>
+          <w:sz w:val="21"/>
+        </w:rPr>
+        <w:t>程序清单：exp3_4_custom_filters.m</w:t>
+      </w:r>
+    </w:p>
+    <w:p>
+      <w:pPr/>
+      <w:r>
+        <w:rPr>
+          <w:rFonts w:ascii="Times New Roman" w:hAnsi="Times New Roman" w:eastAsia="Times New Roman"/>
+          <w:b w:val="0"/>
+          <w:sz w:val="21"/>
+        </w:rPr>
+        <w:t>function exp3_4_custom_filters(rootDir)</w:t>
+        <w:br/>
+        <w:t>rng(20260521);</w:t>
+        <w:br/>
+        <w:t>img = im2double(imread(fullfile(rootDir, 'materials', 'electric.tif')));</w:t>
+        <w:br/>
+        <w:t>if ndims(img) == 3</w:t>
+        <w:br/>
+        <w:t xml:space="preserve">    img = rgb2gray(img);</w:t>
+        <w:br/>
+        <w:t>end</w:t>
+        <w:br/>
+        <w:br/>
+        <w:t>gaussianNoisy = imnoise(img, 'gaussian', 0, 0.2);</w:t>
+        <w:br/>
+        <w:t>saltPepperNoisy = imnoise(img, 'salt &amp; pepper', 0.2);</w:t>
+        <w:br/>
+        <w:t>templateSizes = [3, 5, 9];</w:t>
+        <w:br/>
+        <w:br/>
+        <w:t>fig1 = figure('Visible', 'off', 'Color', 'w', 'Position', [100 100 1400 900]);</w:t>
+        <w:br/>
+        <w:t>tiledlayout(2, 4, 'Padding', 'compact', 'TileSpacing', 'compact');</w:t>
+        <w:br/>
+        <w:t>nexttile; imshow(gaussianNoisy, []); title('Gaussian noise');</w:t>
+        <w:br/>
+        <w:t>for k = 1:numel(templateSizes)</w:t>
+        <w:br/>
+        <w:t xml:space="preserve">    n = templateSizes(k);</w:t>
+        <w:br/>
+        <w:t xml:space="preserve">    filtered = local_mean_filter(gaussianNoisy, n);</w:t>
+        <w:br/>
+        <w:t xml:space="preserve">    nexttile; imshow(filtered, []); title(sprintf('%dx%d custom mean', n, n));</w:t>
+        <w:br/>
+        <w:t>end</w:t>
+        <w:br/>
+        <w:t>nexttile; imshow(saltPepperNoisy, []); title('Salt &amp; pepper noise');</w:t>
+        <w:br/>
+        <w:t>for k = 1:numel(templateSizes)</w:t>
+        <w:br/>
+        <w:t xml:space="preserve">    n = templateSizes(k);</w:t>
+        <w:br/>
+        <w:t xml:space="preserve">    filtered = local_mean_filter(saltPepperNoisy, n);</w:t>
+        <w:br/>
+        <w:t xml:space="preserve">    nexttile; imshow(filtered, []); title(sprintf('%dx%d custom mean', n, n));</w:t>
+        <w:br/>
+        <w:t>end</w:t>
+        <w:br/>
+        <w:t>exportgraphics(fig1, fullfile(rootDir, 'results', 'exp3_4_custom_mean_filter.jpg'), 'Resolution', 180);</w:t>
+        <w:br/>
+        <w:t>close(fig1);</w:t>
+        <w:br/>
+        <w:br/>
+        <w:t>fig2 = figure('Visible', 'off', 'Color', 'w', 'Position', [100 100 1400 900]);</w:t>
+        <w:br/>
+        <w:t>tiledlayout(2, 4, 'Padding', 'compact', 'TileSpacing', 'compact');</w:t>
+        <w:br/>
+        <w:t>nexttile; imshow(gaussianNoisy, []); title('Gaussian noise');</w:t>
+        <w:br/>
+        <w:t>for k = 1:numel(templateSizes)</w:t>
+        <w:br/>
+        <w:t xml:space="preserve">    n = templateSizes(k);</w:t>
+        <w:br/>
+        <w:t xml:space="preserve">    filtered = local_median_filter(gaussianNoisy, n);</w:t>
+        <w:br/>
+        <w:t xml:space="preserve">    nexttile; imshow(filtered, []); title(sprintf('%dx%d custom median', n, n));</w:t>
+        <w:br/>
+        <w:t>end</w:t>
+        <w:br/>
+        <w:t>nexttile; imshow(saltPepperNoisy, []); title('Salt &amp; pepper noise');</w:t>
+        <w:br/>
+        <w:t>for k = 1:numel(templateSizes)</w:t>
+        <w:br/>
+        <w:t xml:space="preserve">    n = templateSizes(k);</w:t>
+        <w:br/>
+        <w:t xml:space="preserve">    filtered = local_median_filter(saltPepperNoisy, n);</w:t>
+        <w:br/>
+        <w:t xml:space="preserve">    nexttile; imshow(filtered, []); title(sprintf('%dx%d custom median', n, n));</w:t>
+        <w:br/>
+        <w:t>end</w:t>
+        <w:br/>
+        <w:t>exportgraphics(fig2, fullfile(rootDir, 'results', 'exp3_4_custom_median_filter.jpg'), 'Resolution', 180);</w:t>
+        <w:br/>
+        <w:t>close(fig2);</w:t>
+        <w:br/>
+        <w:t>end</w:t>
+        <w:br/>
+        <w:br/>
+        <w:t>function out = local_mean_filter(img, n)</w:t>
+        <w:br/>
+        <w:t>pad = floor(n / 2);</w:t>
+        <w:br/>
+        <w:t>padded = padarray(img, [pad pad], 'replicate', 'both');</w:t>
+        <w:br/>
+        <w:t>out = zeros(size(img));</w:t>
+        <w:br/>
+        <w:t>for r = 1:size(img, 1)</w:t>
+        <w:br/>
+        <w:t xml:space="preserve">    for c = 1:size(img, 2)</w:t>
+        <w:br/>
+        <w:t xml:space="preserve">        block = padded(r:r+n-1, c:c+n-1);</w:t>
+        <w:br/>
+        <w:t xml:space="preserve">        out(r, c) = sum(block(:)) / (n * n);</w:t>
+        <w:br/>
+        <w:t xml:space="preserve">    end</w:t>
+        <w:br/>
+        <w:t>end</w:t>
+        <w:br/>
+        <w:t>end</w:t>
+        <w:br/>
+        <w:br/>
+        <w:t>function out = local_median_filter(img, n)</w:t>
+        <w:br/>
+        <w:t>pad = floor(n / 2);</w:t>
+        <w:br/>
+        <w:t>padded = padarray(img, [pad pad], 'replicate', 'both');</w:t>
+        <w:br/>
+        <w:t>out = zeros(size(img));</w:t>
+        <w:br/>
+        <w:t>for r = 1:size(img, 1)</w:t>
+        <w:br/>
+        <w:t xml:space="preserve">    for c = 1:size(img, 2)</w:t>
+        <w:br/>
+        <w:t xml:space="preserve">        block = padded(r:r+n-1, c:c+n-1);</w:t>
+        <w:br/>
+        <w:t xml:space="preserve">        out(r, c) = median(block(:));</w:t>
+        <w:br/>
+        <w:t xml:space="preserve">    end</w:t>
+        <w:br/>
+        <w:t>end</w:t>
+        <w:br/>
+        <w:t>end</w:t>
+        <w:br/>
+      </w:r>
+    </w:p>
+    <w:p>
       <w:pPr>
         <w:pStyle w:val="5"/>
         <w:adjustRightInd w:val="0"/>
@@ -1269,6 +2183,17 @@
       </w:r>
     </w:p>
     <w:p>
+      <w:pPr/>
+      <w:r>
+        <w:rPr>
+          <w:rFonts w:ascii="Times New Roman" w:hAnsi="Times New Roman" w:eastAsia="Times New Roman"/>
+          <w:b w:val="0"/>
+          <w:sz w:val="21"/>
+        </w:rPr>
+        <w:t>回答：图像灰度变换是点运算，输出像素主要由该位置输入像素的灰度值决定，常用于亮度、对比度、阈值和灰度级调整；空间滤波是邻域运算，输出像素由其周围模板内多个像素共同决定，可用于平滑去噪、边缘增强和锐化等处理。</w:t>
+      </w:r>
+    </w:p>
+    <w:p>
       <w:pPr>
         <w:adjustRightInd w:val="0"/>
         <w:snapToGrid w:val="0"/>
@@ -1288,6 +2213,17 @@
       </w:r>
     </w:p>
     <w:p>
+      <w:pPr/>
+      <w:r>
+        <w:rPr>
+          <w:rFonts w:ascii="Times New Roman" w:hAnsi="Times New Roman" w:eastAsia="Times New Roman"/>
+          <w:b w:val="0"/>
+          <w:sz w:val="21"/>
+        </w:rPr>
+        <w:t>回答：空间平滑滤波通常相当于低通处理，可削弱噪声和细小灰度起伏，使图像更平滑，但会带来边缘模糊和细节损失；空间锐化滤波通常突出高频成分和灰度突变，可增强边缘、轮廓和纹理，但也可能同步放大噪声。</w:t>
+      </w:r>
+    </w:p>
+    <w:p>
       <w:pPr>
         <w:adjustRightInd w:val="0"/>
         <w:snapToGrid w:val="0"/>
@@ -1307,6 +2243,17 @@
       </w:r>
     </w:p>
     <w:p>
+      <w:pPr/>
+      <w:r>
+        <w:rPr>
+          <w:rFonts w:ascii="Times New Roman" w:hAnsi="Times New Roman" w:eastAsia="Times New Roman"/>
+          <w:b w:val="0"/>
+          <w:sz w:val="21"/>
+        </w:rPr>
+        <w:t>回答：均值滤波对高斯噪声较有效，因为邻域平均能降低零均值随机扰动，但会模糊边缘；中值滤波对椒盐噪声更有效，因为中值可以排除极端黑白脉冲点并较好保留边缘。对于高斯噪声，中值滤波也能平滑但效果通常不如均值滤波自然；对于椒盐噪声，均值滤波会扩散噪声点，去噪效果不如中值滤波。</w:t>
+      </w:r>
+    </w:p>
+    <w:p>
       <w:pPr>
         <w:adjustRightInd w:val="0"/>
         <w:snapToGrid w:val="0"/>
@@ -1323,6 +2270,17 @@
           <w:lang w:bidi="ar"/>
         </w:rPr>
         <w:t>4.结合实验内容，定性评价滤波模板大小对去噪效果的影响？</w:t>
+      </w:r>
+    </w:p>
+    <w:p>
+      <w:pPr/>
+      <w:r>
+        <w:rPr>
+          <w:rFonts w:ascii="Times New Roman" w:hAnsi="Times New Roman" w:eastAsia="Times New Roman"/>
+          <w:b w:val="0"/>
+          <w:sz w:val="21"/>
+        </w:rPr>
+        <w:t>回答：滤波模板越大，参与计算的邻域像素越多，平滑和去噪能力越强，但图像细节、纹理和边缘也越容易被削弱。实验中3x3模板细节保持较好但对强噪声抑制有限，5x5在去噪和细节之间较折中，9x9去噪更明显但图像模糊最严重。实际应用中应根据噪声强度和细节保留要求选择模板大小。</w:t>
       </w:r>
     </w:p>
     <w:p>

</xml_diff>